<commit_message>
State of Art 1st step
Première analyse des articles issu de ma recherche bibliographique.
</commit_message>
<xml_diff>
--- a/StateOfArt.docx
+++ b/StateOfArt.docx
@@ -3725,7 +3725,14 @@
         <w:rPr>
           <w:lang w:eastAsia="fr-BE"/>
         </w:rPr>
-        <w:t>Anxiété de performance musicale (APM) (B, D)</w:t>
+        <w:t xml:space="preserve">Anxiété de performance musicale (APM) </w:t>
+      </w:r>
+      <w:r>
+        <w:rPr>
+          <w:b/>
+          <w:lang w:eastAsia="fr-BE"/>
+        </w:rPr>
+        <w:t>(B, D)</w:t>
       </w:r>
     </w:p>
     <w:p>
@@ -3958,6 +3965,25 @@
           <w:lang w:eastAsia="fr-BE"/>
         </w:rPr>
       </w:pPr>
+      <w:r>
+        <w:rPr>
+          <w:lang w:eastAsia="fr-BE"/>
+        </w:rPr>
+        <w:t>Anxiété de performance musicale (APM)</w:t>
+      </w:r>
+      <w:r>
+        <w:rPr>
+          <w:lang w:eastAsia="fr-BE"/>
+        </w:rPr>
+        <w:t xml:space="preserve"> </w:t>
+      </w:r>
+      <w:r>
+        <w:rPr>
+          <w:b/>
+          <w:lang w:eastAsia="fr-BE"/>
+        </w:rPr>
+        <w:t>(A, B)</w:t>
+      </w:r>
     </w:p>
     <w:p>
       <w:pPr>
@@ -3967,8 +3993,875 @@
         <w:t>Résumé :</w:t>
       </w:r>
     </w:p>
+    <w:p>
+      <w:r>
+        <w:t>6 pianistes professionnels jouent la même œuvre lors d’un réel concert (public), les chercheurs mesurent (durant le repos, la préparation, le concert, après le concert) les signaux ECG, pression artérielle, conductance cutanée et grâce des méthodes (analyse Wigner-Ville, CWT) ils mesurent la dynamique physiologique.  Il remarque une augmentation de fréquence cardiaque, pression artérielle mais pas de changement significatif sur la conductance cutanée.</w:t>
+      </w:r>
+    </w:p>
+    <w:p>
+      <w:pPr>
+        <w:pStyle w:val="Titre1"/>
+      </w:pPr>
+      <w:r>
+        <w:t>Limitations :</w:t>
+      </w:r>
+    </w:p>
+    <w:p>
+      <w:pPr>
+        <w:rPr>
+          <w:lang w:eastAsia="fr-BE"/>
+        </w:rPr>
+      </w:pPr>
+      <w:r>
+        <w:rPr>
+          <w:lang w:eastAsia="fr-BE"/>
+        </w:rPr>
+        <w:t>6 pianistes (pas instrument à vent) pro (manque de diversité).</w:t>
+      </w:r>
+    </w:p>
+    <w:p>
+      <w:pPr>
+        <w:pStyle w:val="Titre1"/>
+      </w:pPr>
+      <w:r>
+        <w:t>Pertinence :</w:t>
+      </w:r>
+    </w:p>
+    <w:p>
+      <w:r>
+        <w:t>Il confirme que ECG est un excellent indicateur. Et que la méthode Wigner-Ville pour l’analyse MPA est idéal.</w:t>
+      </w:r>
+    </w:p>
+    <w:p>
+      <w:pPr>
+        <w:pStyle w:val="Titre1"/>
+      </w:pPr>
+      <w:r>
+        <w:t>Score :</w:t>
+      </w:r>
+    </w:p>
+    <w:p>
+      <w:r>
+        <w:t>3</w:t>
+      </w:r>
+      <w:r>
+        <w:br w:type="page"/>
+      </w:r>
+    </w:p>
+    <w:p>
+      <w:r>
+        <w:lastRenderedPageBreak/>
+        <w:fldChar w:fldCharType="begin"/>
+      </w:r>
+      <w:r>
+        <w:instrText xml:space="preserve"> ADDIN ZOTERO_ITEM CSL_CITATION {"citationID":"Jps4aMEW","properties":{"formattedCitation":"[13]","plainCitation":"[13]","noteIndex":0},"citationItems":[{"id":11,"uris":["http://zotero.org/users/local/ZDVQpXiA/items/SQ3QXDIT"],"itemData":{"id":11,"type":"article-journal","abstract":"Over the last few decades, a growing number of studies have used wearable technologies, such as inertial and pressure sensors, to investigate various domains of music experience, from performance to education. In this paper, we systematically review this body of literature using the PRISMA (Preferred Reporting Items for Systematic Reviews and Meta-Analyses) method. The initial search yielded a total of 359 records. After removing duplicates and screening for content, 23 records were deemed fully eligible for further analysis. Studies were grouped into four categories based on their main objective, namely performance-oriented systems, measuring physiological parameters, gesture recognition, and sensory mapping. The reviewed literature demonstrated the various ways in which wearable systems impact musical contexts, from the design of multi-sensory instruments to systems monitoring key learning parameters. Limitations also emerged, mostly related to the technology’s comfort and usability, and directions for future research in wearables and music are outlined.","container-title":"Sensors","DOI":"10.3390/s24175783","ISSN":"1424-8220","issue":"17","journalAbbreviation":"Sensors","language":"en","page":"5783","source":"DOI.org (Crossref)","title":"Using Wearable Sensors to Study Musical Experience: A Systematic Review","title-short":"Using Wearable Sensors to Study Musical Experience","volume":"24","author":[{"family":"Volta","given":"Erica"},{"family":"Di Stefano","given":"Nicola"}],"issued":{"date-parts":[["2024",9,5]]}}}],"schema":"https://github.com/citation-style-language/schema/raw/master/csl-citation.json"} </w:instrText>
+      </w:r>
+      <w:r>
+        <w:fldChar w:fldCharType="separate"/>
+      </w:r>
+      <w:r>
+        <w:rPr>
+          <w:rFonts w:ascii="Calibri" w:hAnsi="Calibri" w:cs="Calibri"/>
+        </w:rPr>
+        <w:t>[13]</w:t>
+      </w:r>
+      <w:r>
+        <w:fldChar w:fldCharType="end"/>
+      </w:r>
+    </w:p>
+    <w:p>
+      <w:r>
+        <w:t>E. Volta et N. Di Stefano, « </w:t>
+      </w:r>
+      <w:proofErr w:type="spellStart"/>
+      <w:r>
+        <w:t>Using</w:t>
+      </w:r>
+      <w:proofErr w:type="spellEnd"/>
+      <w:r>
+        <w:t xml:space="preserve"> </w:t>
+      </w:r>
+      <w:proofErr w:type="spellStart"/>
+      <w:r>
+        <w:t>Wearable</w:t>
+      </w:r>
+      <w:proofErr w:type="spellEnd"/>
+      <w:r>
+        <w:t xml:space="preserve"> </w:t>
+      </w:r>
+      <w:proofErr w:type="spellStart"/>
+      <w:r>
+        <w:t>Sensors</w:t>
+      </w:r>
+      <w:proofErr w:type="spellEnd"/>
+      <w:r>
+        <w:t xml:space="preserve"> to </w:t>
+      </w:r>
+      <w:proofErr w:type="spellStart"/>
+      <w:r>
+        <w:t>Study</w:t>
+      </w:r>
+      <w:proofErr w:type="spellEnd"/>
+      <w:r>
+        <w:t xml:space="preserve"> Musical </w:t>
+      </w:r>
+      <w:proofErr w:type="spellStart"/>
+      <w:proofErr w:type="gramStart"/>
+      <w:r>
+        <w:t>Experience</w:t>
+      </w:r>
+      <w:proofErr w:type="spellEnd"/>
+      <w:r>
+        <w:t>:</w:t>
+      </w:r>
+      <w:proofErr w:type="gramEnd"/>
+      <w:r>
+        <w:t xml:space="preserve"> A </w:t>
+      </w:r>
+      <w:proofErr w:type="spellStart"/>
+      <w:r>
+        <w:t>Systematic</w:t>
+      </w:r>
+      <w:proofErr w:type="spellEnd"/>
+      <w:r>
+        <w:t xml:space="preserve"> </w:t>
+      </w:r>
+      <w:proofErr w:type="spellStart"/>
+      <w:r>
+        <w:t>Review</w:t>
+      </w:r>
+      <w:proofErr w:type="spellEnd"/>
+      <w:r>
+        <w:t xml:space="preserve"> », </w:t>
+      </w:r>
+      <w:proofErr w:type="spellStart"/>
+      <w:r>
+        <w:rPr>
+          <w:i/>
+          <w:iCs/>
+        </w:rPr>
+        <w:t>Sensors</w:t>
+      </w:r>
+      <w:proofErr w:type="spellEnd"/>
+      <w:r>
+        <w:t>, vol. 24, n</w:t>
+      </w:r>
+      <w:r>
+        <w:rPr>
+          <w:vertAlign w:val="superscript"/>
+        </w:rPr>
+        <w:t>o</w:t>
+      </w:r>
+      <w:r>
+        <w:t xml:space="preserve"> 17, p. 5783, sept. 2024, </w:t>
+      </w:r>
+      <w:proofErr w:type="spellStart"/>
+      <w:r>
+        <w:t>doi</w:t>
+      </w:r>
+      <w:proofErr w:type="spellEnd"/>
+      <w:r>
+        <w:t>: 10.3390/s24175783.</w:t>
+      </w:r>
+    </w:p>
+    <w:p>
+      <w:pPr>
+        <w:pStyle w:val="Titre1"/>
+      </w:pPr>
+      <w:r>
+        <w:t>Thème :</w:t>
+      </w:r>
+    </w:p>
+    <w:p>
+      <w:pPr>
+        <w:rPr>
+          <w:lang w:eastAsia="fr-BE"/>
+        </w:rPr>
+      </w:pPr>
+      <w:r>
+        <w:rPr>
+          <w:lang w:eastAsia="fr-BE"/>
+        </w:rPr>
+        <w:t xml:space="preserve">Capteurs et mesures physiologiques </w:t>
+      </w:r>
+      <w:r>
+        <w:rPr>
+          <w:b/>
+          <w:lang w:eastAsia="fr-BE"/>
+        </w:rPr>
+        <w:t>(A, B)</w:t>
+      </w:r>
+    </w:p>
+    <w:p>
+      <w:pPr>
+        <w:pStyle w:val="Titre1"/>
+      </w:pPr>
+      <w:r>
+        <w:t>Résumé :</w:t>
+      </w:r>
+    </w:p>
+    <w:p>
+      <w:r>
+        <w:t>Revue systématique pour comprendre quels capteurs et quelles variables permettent d’évaluer la performance musicale.</w:t>
+      </w:r>
+      <w:r>
+        <w:t xml:space="preserve"> Capteurs physiologiques : fréquence cardiaque, EMG, respiration, capteurs de mouvement : accéléromètre, gyroscope et capteur inertiel, capteur de pression. Les systèmes multimodaux les plus prometteurs sont ceux combinant physiologie, mouvement et audio.</w:t>
+      </w:r>
+    </w:p>
+    <w:p>
+      <w:pPr>
+        <w:pStyle w:val="Titre1"/>
+      </w:pPr>
+      <w:r>
+        <w:t>Limitations :</w:t>
+      </w:r>
+    </w:p>
+    <w:p>
+      <w:pPr>
+        <w:pStyle w:val="Titre1"/>
+      </w:pPr>
+      <w:r>
+        <w:t>Pertinence :</w:t>
+      </w:r>
+    </w:p>
+    <w:p>
+      <w:r>
+        <w:t>Justifie l’existence du projet (=impact de la réservation sur l’état multimodale du confort d’un tromboniste)</w:t>
+      </w:r>
+    </w:p>
+    <w:p>
+      <w:pPr>
+        <w:pStyle w:val="Titre1"/>
+      </w:pPr>
+      <w:r>
+        <w:t>Score :</w:t>
+      </w:r>
+    </w:p>
+    <w:p>
+      <w:r>
+        <w:t>2+</w:t>
+      </w:r>
+      <w:r>
+        <w:br w:type="page"/>
+      </w:r>
+    </w:p>
+    <w:p>
+      <w:r>
+        <w:lastRenderedPageBreak/>
+        <w:fldChar w:fldCharType="begin"/>
+      </w:r>
+      <w:r>
+        <w:instrText xml:space="preserve"> ADDIN ZOTERO_ITEM CSL_CITATION {"citationID":"Dz81apLq","properties":{"formattedCitation":"[14]","plainCitation":"[14]","noteIndex":0},"citationItems":[{"id":8,"uris":["http://zotero.org/users/local/ZDVQpXiA/items/2QBH88VI"],"itemData":{"id":8,"type":"article-journal","container-title":"Scientific Reports","DOI":"10.1038/s41598-024-73593-4","ISSN":"2045-2322","issue":"1","journalAbbreviation":"Sci Rep","language":"en","page":"22267","source":"DOI.org (Crossref)","title":"Expressivity attributed to music affects the smoothness of bowing movements in violinists","volume":"14","author":[{"family":"Di Stefano","given":"Nicola"},{"family":"Lo Presti","given":"Daniela"},{"family":"Raiano","given":"Luigi"},{"family":"Massaroni","given":"Carlo"},{"family":"Romano","given":"Chiara"},{"family":"Schena","given":"Emiliano"},{"family":"Leman","given":"Marc"},{"family":"Formica","given":"Domenico"}],"issued":{"date-parts":[["2024",9,27]]}}}],"schema":"https://github.com/citation-style-language/schema/raw/master/csl-citation.json"} </w:instrText>
+      </w:r>
+      <w:r>
+        <w:fldChar w:fldCharType="separate"/>
+      </w:r>
+      <w:r>
+        <w:rPr>
+          <w:rFonts w:ascii="Calibri" w:hAnsi="Calibri" w:cs="Calibri"/>
+        </w:rPr>
+        <w:t>[14]</w:t>
+      </w:r>
+      <w:r>
+        <w:fldChar w:fldCharType="end"/>
+      </w:r>
+    </w:p>
+    <w:p>
+      <w:r>
+        <w:t xml:space="preserve">N. Di Stefano </w:t>
+      </w:r>
+      <w:r>
+        <w:rPr>
+          <w:i/>
+          <w:iCs/>
+        </w:rPr>
+        <w:t>et al.</w:t>
+      </w:r>
+      <w:r>
+        <w:t>, « </w:t>
+      </w:r>
+      <w:proofErr w:type="spellStart"/>
+      <w:r>
+        <w:t>Expressivity</w:t>
+      </w:r>
+      <w:proofErr w:type="spellEnd"/>
+      <w:r>
+        <w:t xml:space="preserve"> </w:t>
+      </w:r>
+      <w:proofErr w:type="spellStart"/>
+      <w:r>
+        <w:t>attributed</w:t>
+      </w:r>
+      <w:proofErr w:type="spellEnd"/>
+      <w:r>
+        <w:t xml:space="preserve"> to music affects the </w:t>
+      </w:r>
+      <w:proofErr w:type="spellStart"/>
+      <w:r>
+        <w:t>smoothness</w:t>
+      </w:r>
+      <w:proofErr w:type="spellEnd"/>
+      <w:r>
+        <w:t xml:space="preserve"> of </w:t>
+      </w:r>
+      <w:proofErr w:type="spellStart"/>
+      <w:r>
+        <w:t>bowing</w:t>
+      </w:r>
+      <w:proofErr w:type="spellEnd"/>
+      <w:r>
+        <w:t xml:space="preserve"> </w:t>
+      </w:r>
+      <w:proofErr w:type="spellStart"/>
+      <w:r>
+        <w:t>movements</w:t>
+      </w:r>
+      <w:proofErr w:type="spellEnd"/>
+      <w:r>
+        <w:t xml:space="preserve"> in </w:t>
+      </w:r>
+      <w:proofErr w:type="spellStart"/>
+      <w:r>
+        <w:t>violinists</w:t>
+      </w:r>
+      <w:proofErr w:type="spellEnd"/>
+      <w:r>
+        <w:t xml:space="preserve"> », </w:t>
+      </w:r>
+      <w:proofErr w:type="spellStart"/>
+      <w:r>
+        <w:rPr>
+          <w:i/>
+          <w:iCs/>
+        </w:rPr>
+        <w:t>Sci</w:t>
+      </w:r>
+      <w:proofErr w:type="spellEnd"/>
+      <w:r>
+        <w:rPr>
+          <w:i/>
+          <w:iCs/>
+        </w:rPr>
+        <w:t>. Rep.</w:t>
+      </w:r>
+      <w:r>
+        <w:t>, vol. 14, n</w:t>
+      </w:r>
+      <w:r>
+        <w:rPr>
+          <w:vertAlign w:val="superscript"/>
+        </w:rPr>
+        <w:t>o</w:t>
+      </w:r>
+      <w:r>
+        <w:t xml:space="preserve"> 1, p. 22267, sept. 2024, </w:t>
+      </w:r>
+      <w:proofErr w:type="spellStart"/>
+      <w:proofErr w:type="gramStart"/>
+      <w:r>
+        <w:t>doi</w:t>
+      </w:r>
+      <w:proofErr w:type="spellEnd"/>
+      <w:r>
+        <w:t>:</w:t>
+      </w:r>
+      <w:proofErr w:type="gramEnd"/>
+      <w:r>
+        <w:t xml:space="preserve"> 10.1038/s41598-024-73593-4.</w:t>
+      </w:r>
+    </w:p>
+    <w:p>
+      <w:pPr>
+        <w:pStyle w:val="Titre1"/>
+      </w:pPr>
+      <w:r>
+        <w:t>Thème :</w:t>
+      </w:r>
+    </w:p>
+    <w:p>
+      <w:pPr>
+        <w:rPr>
+          <w:lang w:eastAsia="fr-BE"/>
+        </w:rPr>
+      </w:pPr>
+    </w:p>
+    <w:p>
+      <w:pPr>
+        <w:pStyle w:val="Titre1"/>
+      </w:pPr>
+      <w:r>
+        <w:t>Résumé :</w:t>
+      </w:r>
+    </w:p>
+    <w:p>
+      <w:r>
+        <w:t>Comment influence la difficulté musicale sur la fluidité du mouvement de l’archet ?</w:t>
+      </w:r>
+    </w:p>
+    <w:p>
+      <w:r>
+        <w:t>12 violonistes qui jouent des pièces de complexité différentes et enregistrement de ECG, GSR, mouvement (accéléromètre et gyroscope, poignet et coude) après cela étude subjective de la part du musicien (note de 1 à 10 sur la difficulté)</w:t>
+      </w:r>
+      <w:r>
+        <w:t>. Conclusion, on observe des mouvements moins fluides avec la complexité et les signaux physiologique reflète bien l’état interne du musicien.</w:t>
+      </w:r>
+    </w:p>
+    <w:p>
+      <w:pPr>
+        <w:pStyle w:val="Titre1"/>
+      </w:pPr>
+      <w:r>
+        <w:t>Limitations :</w:t>
+      </w:r>
+    </w:p>
+    <w:p>
+      <w:pPr>
+        <w:pStyle w:val="Titre1"/>
+      </w:pPr>
+      <w:r>
+        <w:t>Pertinence :</w:t>
+      </w:r>
+    </w:p>
+    <w:p>
+      <w:r>
+        <w:t>Exactement le projet mais ici sur le mouvement de l’archet et vis-à-vis de la complexité de l’œuvre.</w:t>
+      </w:r>
+    </w:p>
+    <w:p>
+      <w:pPr>
+        <w:pStyle w:val="Titre1"/>
+      </w:pPr>
+      <w:r>
+        <w:t>Score :</w:t>
+      </w:r>
+    </w:p>
+    <w:p>
+      <w:r>
+        <w:t>3+</w:t>
+      </w:r>
+      <w:r>
+        <w:br w:type="page"/>
+      </w:r>
+    </w:p>
+    <w:p>
+      <w:r>
+        <w:lastRenderedPageBreak/>
+        <w:fldChar w:fldCharType="begin"/>
+      </w:r>
+      <w:r>
+        <w:instrText xml:space="preserve"> ADDIN ZOTERO_ITEM CSL_CITATION {"citationID":"3K4AXTf5","properties":{"formattedCitation":"[15]","plainCitation":"[15]","noteIndex":0},"citationItems":[{"id":20,"uris":["http://zotero.org/users/local/ZDVQpXiA/items/MYHW69Z4"],"itemData":{"id":20,"type":"article-journal","abstract":"Introduction\n              Mental Workload (MWL) is a concept that has garnered increasing interest in professional settings but remains challenging to define consensually. The literature reports a plurality of operational definitions and assessment methods, with no established unified framework. This review aims to identify objective and validated measurement methods for evaluating MWL in real-world work contexts. Particular attention is given to neurophysiological methods, recognized for their efficiency and robustness, enabling real-time assessment without disrupting operator activity.\n            \n            \n              Method\n              To conduct this analysis, a systematic search was performed in three databases (PubMed, ScienceDirect, and IEEEXplore), covering studies published from their inception until March 30, 2023. Selection criteria included research focusing on MWL and its derivatives, as well as neurophysiological measures applied in real-world conditions. An initial screening based on titles and abstracts was followed by an in-depth review, assisted by the bibliometric software Rayyan.\n            \n            \n              Results\n              The explored concepts, applied methods, and study results were compiled into a synthesis table. Ultimately, 35 studies were included, highlighting the diversity of measurement tools used in field settings, often combined with subjective assessments.\n            \n            \n              Discussion\n              Furthermore, key physiological indicators such as ECG, eye data, EEG and the relationship between MWL metrics and those uses to measure stress are emphasized and discussed. A better understanding of these interrelations could refine the assessment of their respective impacts and help anticipate their consequences on workers' mental health and safety.","container-title":"Frontiers in Neuroergonomics","DOI":"10.3389/fnrgo.2025.1584736","ISSN":"2673-6195","journalAbbreviation":"Front. Neuroergonomics","page":"1584736","source":"DOI.org (Crossref)","title":"Systematic review of neurophysiological assessment techniques and metrics for mental workload evaluation in real-world settings","volume":"6","author":[{"family":"Diarra","given":"Moussa"},{"family":"Theurel","given":"Jean"},{"family":"Paty","given":"Benjamin"}],"issued":{"date-parts":[["2025",4,25]]}}}],"schema":"https://github.com/citation-style-language/schema/raw/master/csl-citation.json"} </w:instrText>
+      </w:r>
+      <w:r>
+        <w:fldChar w:fldCharType="separate"/>
+      </w:r>
+      <w:r>
+        <w:rPr>
+          <w:rFonts w:ascii="Calibri" w:hAnsi="Calibri" w:cs="Calibri"/>
+        </w:rPr>
+        <w:t>[15]</w:t>
+      </w:r>
+      <w:r>
+        <w:fldChar w:fldCharType="end"/>
+      </w:r>
+    </w:p>
+    <w:p>
+      <w:r>
+        <w:t xml:space="preserve">M. Diarra, J. </w:t>
+      </w:r>
+      <w:proofErr w:type="spellStart"/>
+      <w:r>
+        <w:t>Theurel</w:t>
+      </w:r>
+      <w:proofErr w:type="spellEnd"/>
+      <w:r>
+        <w:t>, et B. Paty, « </w:t>
+      </w:r>
+      <w:proofErr w:type="spellStart"/>
+      <w:r>
+        <w:t>Systematic</w:t>
+      </w:r>
+      <w:proofErr w:type="spellEnd"/>
+      <w:r>
+        <w:t xml:space="preserve"> </w:t>
+      </w:r>
+      <w:proofErr w:type="spellStart"/>
+      <w:r>
+        <w:t>review</w:t>
+      </w:r>
+      <w:proofErr w:type="spellEnd"/>
+      <w:r>
+        <w:t xml:space="preserve"> of </w:t>
+      </w:r>
+      <w:proofErr w:type="spellStart"/>
+      <w:r>
+        <w:t>neurophysiological</w:t>
+      </w:r>
+      <w:proofErr w:type="spellEnd"/>
+      <w:r>
+        <w:t xml:space="preserve"> </w:t>
+      </w:r>
+      <w:proofErr w:type="spellStart"/>
+      <w:r>
+        <w:t>assessment</w:t>
+      </w:r>
+      <w:proofErr w:type="spellEnd"/>
+      <w:r>
+        <w:t xml:space="preserve"> techniques and </w:t>
+      </w:r>
+      <w:proofErr w:type="spellStart"/>
+      <w:r>
+        <w:t>metrics</w:t>
+      </w:r>
+      <w:proofErr w:type="spellEnd"/>
+      <w:r>
+        <w:t xml:space="preserve"> for mental </w:t>
+      </w:r>
+      <w:proofErr w:type="spellStart"/>
+      <w:r>
+        <w:t>workload</w:t>
+      </w:r>
+      <w:proofErr w:type="spellEnd"/>
+      <w:r>
+        <w:t xml:space="preserve"> </w:t>
+      </w:r>
+      <w:proofErr w:type="spellStart"/>
+      <w:r>
+        <w:t>evaluation</w:t>
+      </w:r>
+      <w:proofErr w:type="spellEnd"/>
+      <w:r>
+        <w:t xml:space="preserve"> in real-world settings », </w:t>
+      </w:r>
+      <w:r>
+        <w:rPr>
+          <w:i/>
+          <w:iCs/>
+        </w:rPr>
+        <w:t xml:space="preserve">Front. </w:t>
+      </w:r>
+      <w:proofErr w:type="spellStart"/>
+      <w:r>
+        <w:rPr>
+          <w:i/>
+          <w:iCs/>
+        </w:rPr>
+        <w:t>Neuroergonomics</w:t>
+      </w:r>
+      <w:proofErr w:type="spellEnd"/>
+      <w:r>
+        <w:t xml:space="preserve">, vol. 6, p. 1584736, avr. 2025, </w:t>
+      </w:r>
+      <w:proofErr w:type="spellStart"/>
+      <w:proofErr w:type="gramStart"/>
+      <w:r>
+        <w:t>doi</w:t>
+      </w:r>
+      <w:proofErr w:type="spellEnd"/>
+      <w:r>
+        <w:t>:</w:t>
+      </w:r>
+      <w:proofErr w:type="gramEnd"/>
+      <w:r>
+        <w:t xml:space="preserve"> 10.3389/fnrgo.2025.1584736.</w:t>
+      </w:r>
+    </w:p>
+    <w:p>
+      <w:pPr>
+        <w:pStyle w:val="Titre1"/>
+      </w:pPr>
+      <w:r>
+        <w:t>Thème :</w:t>
+      </w:r>
+    </w:p>
+    <w:p>
+      <w:pPr>
+        <w:rPr>
+          <w:b/>
+          <w:lang w:eastAsia="fr-BE"/>
+        </w:rPr>
+      </w:pPr>
+      <w:r>
+        <w:rPr>
+          <w:lang w:eastAsia="fr-BE"/>
+        </w:rPr>
+        <w:t xml:space="preserve">Signaux physiologiques de mesure de charge mentale </w:t>
+      </w:r>
+      <w:r>
+        <w:rPr>
+          <w:b/>
+          <w:lang w:eastAsia="fr-BE"/>
+        </w:rPr>
+        <w:t>(A</w:t>
+      </w:r>
+      <w:r>
+        <w:rPr>
+          <w:b/>
+          <w:lang w:eastAsia="fr-BE"/>
+        </w:rPr>
+        <w:t>)</w:t>
+      </w:r>
+    </w:p>
+    <w:p>
+      <w:pPr>
+        <w:pStyle w:val="Titre1"/>
+      </w:pPr>
+      <w:r>
+        <w:t>Résumé :</w:t>
+      </w:r>
+    </w:p>
+    <w:p>
+      <w:pPr>
+        <w:rPr>
+          <w:lang w:eastAsia="fr-BE"/>
+        </w:rPr>
+      </w:pPr>
+      <w:r>
+        <w:rPr>
+          <w:lang w:eastAsia="fr-BE"/>
+        </w:rPr>
+        <w:t xml:space="preserve">Revue systématique analysant les méthodes de mesure de charge mentale par signaux physiologiques en situations réelles. Les meilleurs signaux : ECG (fréquence cardiaque et HRV), EEG et </w:t>
+      </w:r>
+      <w:proofErr w:type="spellStart"/>
+      <w:r>
+        <w:rPr>
+          <w:lang w:eastAsia="fr-BE"/>
+        </w:rPr>
+        <w:t>fNIRS</w:t>
+      </w:r>
+      <w:proofErr w:type="spellEnd"/>
+      <w:r>
+        <w:rPr>
+          <w:lang w:eastAsia="fr-BE"/>
+        </w:rPr>
+        <w:t xml:space="preserve"> (activité cérébrale via oxygénation), activité oculaire, activité électrodermale (EDA et GSR), autres utiles (respiration, température de la peau, EMG, biomarqueurs salivaires) dépend de l’application (tâche).</w:t>
+      </w:r>
+    </w:p>
+    <w:p>
+      <w:pPr>
+        <w:pStyle w:val="Titre1"/>
+      </w:pPr>
+      <w:r>
+        <w:t>Limitations :</w:t>
+      </w:r>
+    </w:p>
+    <w:p>
+      <w:pPr>
+        <w:rPr>
+          <w:lang w:eastAsia="fr-BE"/>
+        </w:rPr>
+      </w:pPr>
+      <w:r>
+        <w:rPr>
+          <w:lang w:eastAsia="fr-BE"/>
+        </w:rPr>
+        <w:t>Tâche globale dans la vie pas focalisé musique. Biomarqueurs salivaires trop difficile à collecter et utiliser et signaux EEG complexe dans des conditions réelles (si peu focalisé à la tâche)</w:t>
+      </w:r>
+    </w:p>
+    <w:p>
+      <w:pPr>
+        <w:pStyle w:val="Titre1"/>
+      </w:pPr>
+      <w:r>
+        <w:t>Pertinence :</w:t>
+      </w:r>
+    </w:p>
+    <w:p>
+      <w:r>
+        <w:t>L’article confirme que pour un type d’utilisation l’EMG, la respiration peuvent être utile mais que ECG, HRV, GSR et EDA sont indispensables.</w:t>
+      </w:r>
+    </w:p>
+    <w:p>
+      <w:pPr>
+        <w:pStyle w:val="Titre1"/>
+      </w:pPr>
+      <w:r>
+        <w:t>Score :</w:t>
+      </w:r>
+    </w:p>
+    <w:p>
+      <w:r>
+        <w:t>2+</w:t>
+      </w:r>
+    </w:p>
     <w:p/>
     <w:p>
+      <w:r>
+        <w:br w:type="page"/>
+      </w:r>
+    </w:p>
+    <w:p>
+      <w:r>
+        <w:lastRenderedPageBreak/>
+        <w:fldChar w:fldCharType="begin"/>
+      </w:r>
+      <w:r>
+        <w:instrText xml:space="preserve"> ADDIN ZOTERO_ITEM CSL_CITATION {"citationID":"3mPyFzCb","properties":{"formattedCitation":"[16]","plainCitation":"[16]","noteIndex":0},"citationItems":[{"id":26,"uris":["http://zotero.org/users/local/ZDVQpXiA/items/JEUHP83W"],"itemData":{"id":26,"type":"article-journal","abstract":"Electroencephalographic (EEG) signal-based personal identification systems have notable advantages and disadvantages. These systems heavily rely on the stability of EEG signals, which several factors. One of the primary factors affecting the stability of EEG signals is an individual's emotional state. Among emotional states, stress significantly impairs people's ability to perform daily tasks. This research aims to identify stress levels, classified as low (2) and high (1), using features from Independent Component Analysis (ICA) and Principal Component Analysis (PCA). Machine learning methods, including Decision Tree, k-Nearest Neighbors (k-NN), Naive Bayes, Support Vector Machine (SVM), and Ensemble techniques, are employed to classify the stress levels. The dataset comprises 40 EEG recordings from the Stroop color-word test, and the data is split using a random holdout function with a ratio of 80% for training and 20% for testing. This study examines the most effective features for identifying stress levels and compares the performance of various machine learning models. The experimental results demonstrate that PCA is the most effective feature extraction method, achieving an average accuracy of 0.718 in stress level classification. Among the machine learning models tested, the Ensemble method performs the best, achieving an accuracy of 0.770 when using PCA features and 0.745 with ICA features. This study highlights the importance of selecting optimal features and machine learning techniques for improving stress detection in EEG-based systems. Further improvements in classification accuracy may be achieved by incorporating additional physiological signals or refining feature extraction techniques.","container-title":"JOIV : International Journal on Informatics Visualization","DOI":"10.62527/joiv.9.3.3378","ISSN":"2549-9904, 2549-9610","issue":"3","journalAbbreviation":"JOIV : Int. J. Inform. Visualization","license":"http://creativecommons.org/licenses/by-sa/4.0","page":"1226","source":"DOI.org (Crossref)","title":"A Hybrid Machine Learning Approach Utilizing PCA and ICA Features for Stress Classification","volume":"9","author":[{"family":"Setyorini","given":"Setyorini"},{"family":"Elbaith Zaeni","given":"Ilham Ari"},{"family":"Elmunsyah","given":"Hakkun"}],"issued":{"date-parts":[["2025",5,31]]}}}],"schema":"https://github.com/citation-style-language/schema/raw/master/csl-citation.json"} </w:instrText>
+      </w:r>
+      <w:r>
+        <w:fldChar w:fldCharType="separate"/>
+      </w:r>
+      <w:r>
+        <w:rPr>
+          <w:rFonts w:ascii="Calibri" w:hAnsi="Calibri" w:cs="Calibri"/>
+        </w:rPr>
+        <w:t>[16]</w:t>
+      </w:r>
+      <w:r>
+        <w:fldChar w:fldCharType="end"/>
+      </w:r>
+    </w:p>
+    <w:p>
+      <w:r>
+        <w:t xml:space="preserve">S. </w:t>
+      </w:r>
+      <w:proofErr w:type="spellStart"/>
+      <w:r>
+        <w:t>Setyorini</w:t>
+      </w:r>
+      <w:proofErr w:type="spellEnd"/>
+      <w:r>
+        <w:t xml:space="preserve">, I. A. </w:t>
+      </w:r>
+      <w:proofErr w:type="spellStart"/>
+      <w:r>
+        <w:t>Elbaith</w:t>
+      </w:r>
+      <w:proofErr w:type="spellEnd"/>
+      <w:r>
+        <w:t xml:space="preserve"> </w:t>
+      </w:r>
+      <w:proofErr w:type="spellStart"/>
+      <w:r>
+        <w:t>Zaeni</w:t>
+      </w:r>
+      <w:proofErr w:type="spellEnd"/>
+      <w:r>
+        <w:t xml:space="preserve">, et H. </w:t>
+      </w:r>
+      <w:proofErr w:type="spellStart"/>
+      <w:r>
+        <w:t>Elmunsyah</w:t>
+      </w:r>
+      <w:proofErr w:type="spellEnd"/>
+      <w:r>
+        <w:t xml:space="preserve">, « A </w:t>
+      </w:r>
+      <w:proofErr w:type="spellStart"/>
+      <w:r>
+        <w:t>Hybrid</w:t>
+      </w:r>
+      <w:proofErr w:type="spellEnd"/>
+      <w:r>
+        <w:t xml:space="preserve"> Machine Learning </w:t>
+      </w:r>
+      <w:proofErr w:type="spellStart"/>
+      <w:r>
+        <w:t>Approach</w:t>
+      </w:r>
+      <w:proofErr w:type="spellEnd"/>
+      <w:r>
+        <w:t xml:space="preserve"> </w:t>
+      </w:r>
+      <w:proofErr w:type="spellStart"/>
+      <w:r>
+        <w:t>Utilizing</w:t>
+      </w:r>
+      <w:proofErr w:type="spellEnd"/>
+      <w:r>
+        <w:t xml:space="preserve"> PCA and ICA </w:t>
+      </w:r>
+      <w:proofErr w:type="spellStart"/>
+      <w:r>
+        <w:t>Features</w:t>
+      </w:r>
+      <w:proofErr w:type="spellEnd"/>
+      <w:r>
+        <w:t xml:space="preserve"> for Stress Classification », </w:t>
+      </w:r>
+      <w:r>
+        <w:rPr>
+          <w:i/>
+          <w:iCs/>
+        </w:rPr>
+        <w:t xml:space="preserve">JOIV Int. J. </w:t>
+      </w:r>
+      <w:proofErr w:type="spellStart"/>
+      <w:r>
+        <w:rPr>
+          <w:i/>
+          <w:iCs/>
+        </w:rPr>
+        <w:t>Inform</w:t>
+      </w:r>
+      <w:proofErr w:type="spellEnd"/>
+      <w:r>
+        <w:rPr>
+          <w:i/>
+          <w:iCs/>
+        </w:rPr>
+        <w:t>. Vis.</w:t>
+      </w:r>
+      <w:r>
+        <w:t>, vol. 9, n</w:t>
+      </w:r>
+      <w:r>
+        <w:rPr>
+          <w:vertAlign w:val="superscript"/>
+        </w:rPr>
+        <w:t>o</w:t>
+      </w:r>
+      <w:r>
+        <w:t xml:space="preserve"> 3, p. 1226, mai 2025, </w:t>
+      </w:r>
+      <w:proofErr w:type="spellStart"/>
+      <w:proofErr w:type="gramStart"/>
+      <w:r>
+        <w:t>doi</w:t>
+      </w:r>
+      <w:proofErr w:type="spellEnd"/>
+      <w:r>
+        <w:t>:</w:t>
+      </w:r>
+      <w:proofErr w:type="gramEnd"/>
+      <w:r>
+        <w:t xml:space="preserve"> 10.62527/joiv.9.3.3378.</w:t>
+      </w:r>
+    </w:p>
+    <w:p>
+      <w:pPr>
+        <w:pStyle w:val="Titre1"/>
+      </w:pPr>
+      <w:r>
+        <w:t>Thème :</w:t>
+      </w:r>
+    </w:p>
+    <w:p>
+      <w:pPr>
+        <w:rPr>
+          <w:lang w:eastAsia="fr-BE"/>
+        </w:rPr>
+      </w:pPr>
+      <w:r>
+        <w:rPr>
+          <w:lang w:eastAsia="fr-BE"/>
+        </w:rPr>
+        <w:t>Niveau de stress sur base de signaux EEG</w:t>
+      </w:r>
+    </w:p>
+    <w:p>
+      <w:pPr>
+        <w:pStyle w:val="Titre1"/>
+      </w:pPr>
+      <w:r>
+        <w:t>Résumé :</w:t>
+      </w:r>
+    </w:p>
+    <w:p>
+      <w:r>
+        <w:t>Extraction PCA et ICA des signaux EEG enregistrés avec 32 électrodes après nettoiement des artefacts (clignement, mouvement, …). L’ICA s’avère moins efficace que PCA pour extraire les caractéristiques pertinentes liées au stress.</w:t>
+      </w:r>
+    </w:p>
+    <w:p>
       <w:pPr>
         <w:pStyle w:val="Titre1"/>
       </w:pPr>
@@ -3982,179 +4875,16 @@
           <w:lang w:eastAsia="fr-BE"/>
         </w:rPr>
       </w:pPr>
-    </w:p>
-    <w:p>
-      <w:pPr>
-        <w:pStyle w:val="Titre1"/>
-      </w:pPr>
-      <w:r>
-        <w:t>Pertinence :</w:t>
-      </w:r>
-    </w:p>
-    <w:p/>
-    <w:p>
-      <w:pPr>
-        <w:pStyle w:val="Titre1"/>
-      </w:pPr>
-      <w:r>
-        <w:t>Score :</w:t>
-      </w:r>
-    </w:p>
-    <w:p>
-      <w:r>
-        <w:br w:type="page"/>
+      <w:r>
+        <w:rPr>
+          <w:lang w:eastAsia="fr-BE"/>
+        </w:rPr>
+        <w:t>Utilisation de signaux EEG</w:t>
       </w:r>
       <w:bookmarkStart w:id="0" w:name="_GoBack"/>
       <w:bookmarkEnd w:id="0"/>
     </w:p>
     <w:p>
-      <w:r>
-        <w:lastRenderedPageBreak/>
-        <w:fldChar w:fldCharType="begin"/>
-      </w:r>
-      <w:r>
-        <w:instrText xml:space="preserve"> ADDIN ZOTERO_ITEM CSL_CITATION {"citationID":"Jps4aMEW","properties":{"formattedCitation":"[13]","plainCitation":"[13]","noteIndex":0},"citationItems":[{"id":11,"uris":["http://zotero.org/users/local/ZDVQpXiA/items/SQ3QXDIT"],"itemData":{"id":11,"type":"article-journal","abstract":"Over the last few decades, a growing number of studies have used wearable technologies, such as inertial and pressure sensors, to investigate various domains of music experience, from performance to education. In this paper, we systematically review this body of literature using the PRISMA (Preferred Reporting Items for Systematic Reviews and Meta-Analyses) method. The initial search yielded a total of 359 records. After removing duplicates and screening for content, 23 records were deemed fully eligible for further analysis. Studies were grouped into four categories based on their main objective, namely performance-oriented systems, measuring physiological parameters, gesture recognition, and sensory mapping. The reviewed literature demonstrated the various ways in which wearable systems impact musical contexts, from the design of multi-sensory instruments to systems monitoring key learning parameters. Limitations also emerged, mostly related to the technology’s comfort and usability, and directions for future research in wearables and music are outlined.","container-title":"Sensors","DOI":"10.3390/s24175783","ISSN":"1424-8220","issue":"17","journalAbbreviation":"Sensors","language":"en","page":"5783","source":"DOI.org (Crossref)","title":"Using Wearable Sensors to Study Musical Experience: A Systematic Review","title-short":"Using Wearable Sensors to Study Musical Experience","volume":"24","author":[{"family":"Volta","given":"Erica"},{"family":"Di Stefano","given":"Nicola"}],"issued":{"date-parts":[["2024",9,5]]}}}],"schema":"https://github.com/citation-style-language/schema/raw/master/csl-citation.json"} </w:instrText>
-      </w:r>
-      <w:r>
-        <w:fldChar w:fldCharType="separate"/>
-      </w:r>
-      <w:r>
-        <w:rPr>
-          <w:rFonts w:ascii="Calibri" w:hAnsi="Calibri" w:cs="Calibri"/>
-        </w:rPr>
-        <w:t>[13]</w:t>
-      </w:r>
-      <w:r>
-        <w:fldChar w:fldCharType="end"/>
-      </w:r>
-    </w:p>
-    <w:p>
-      <w:r>
-        <w:t>E. Volta et N. Di Stefano, « </w:t>
-      </w:r>
-      <w:proofErr w:type="spellStart"/>
-      <w:r>
-        <w:t>Using</w:t>
-      </w:r>
-      <w:proofErr w:type="spellEnd"/>
-      <w:r>
-        <w:t xml:space="preserve"> </w:t>
-      </w:r>
-      <w:proofErr w:type="spellStart"/>
-      <w:r>
-        <w:t>Wearable</w:t>
-      </w:r>
-      <w:proofErr w:type="spellEnd"/>
-      <w:r>
-        <w:t xml:space="preserve"> </w:t>
-      </w:r>
-      <w:proofErr w:type="spellStart"/>
-      <w:r>
-        <w:t>Sensors</w:t>
-      </w:r>
-      <w:proofErr w:type="spellEnd"/>
-      <w:r>
-        <w:t xml:space="preserve"> to </w:t>
-      </w:r>
-      <w:proofErr w:type="spellStart"/>
-      <w:r>
-        <w:t>Study</w:t>
-      </w:r>
-      <w:proofErr w:type="spellEnd"/>
-      <w:r>
-        <w:t xml:space="preserve"> Musical </w:t>
-      </w:r>
-      <w:proofErr w:type="spellStart"/>
-      <w:proofErr w:type="gramStart"/>
-      <w:r>
-        <w:t>Experience</w:t>
-      </w:r>
-      <w:proofErr w:type="spellEnd"/>
-      <w:r>
-        <w:t>:</w:t>
-      </w:r>
-      <w:proofErr w:type="gramEnd"/>
-      <w:r>
-        <w:t xml:space="preserve"> A </w:t>
-      </w:r>
-      <w:proofErr w:type="spellStart"/>
-      <w:r>
-        <w:t>Systematic</w:t>
-      </w:r>
-      <w:proofErr w:type="spellEnd"/>
-      <w:r>
-        <w:t xml:space="preserve"> </w:t>
-      </w:r>
-      <w:proofErr w:type="spellStart"/>
-      <w:r>
-        <w:t>Review</w:t>
-      </w:r>
-      <w:proofErr w:type="spellEnd"/>
-      <w:r>
-        <w:t xml:space="preserve"> », </w:t>
-      </w:r>
-      <w:proofErr w:type="spellStart"/>
-      <w:r>
-        <w:rPr>
-          <w:i/>
-          <w:iCs/>
-        </w:rPr>
-        <w:t>Sensors</w:t>
-      </w:r>
-      <w:proofErr w:type="spellEnd"/>
-      <w:r>
-        <w:t>, vol. 24, n</w:t>
-      </w:r>
-      <w:r>
-        <w:rPr>
-          <w:vertAlign w:val="superscript"/>
-        </w:rPr>
-        <w:t>o</w:t>
-      </w:r>
-      <w:r>
-        <w:t xml:space="preserve"> 17, p. 5783, sept. 2024, </w:t>
-      </w:r>
-      <w:proofErr w:type="spellStart"/>
-      <w:r>
-        <w:t>doi</w:t>
-      </w:r>
-      <w:proofErr w:type="spellEnd"/>
-      <w:r>
-        <w:t>: 10.3390/s24175783.</w:t>
-      </w:r>
-    </w:p>
-    <w:p>
-      <w:pPr>
-        <w:pStyle w:val="Titre1"/>
-      </w:pPr>
-      <w:r>
-        <w:t>Thème :</w:t>
-      </w:r>
-    </w:p>
-    <w:p>
-      <w:pPr>
-        <w:rPr>
-          <w:lang w:eastAsia="fr-BE"/>
-        </w:rPr>
-      </w:pPr>
-    </w:p>
-    <w:p>
-      <w:pPr>
-        <w:pStyle w:val="Titre1"/>
-      </w:pPr>
-      <w:r>
-        <w:t>Résumé :</w:t>
-      </w:r>
-    </w:p>
-    <w:p/>
-    <w:p>
-      <w:pPr>
-        <w:rPr>
-          <w:lang w:eastAsia="fr-BE"/>
-        </w:rPr>
-      </w:pPr>
-    </w:p>
-    <w:p>
       <w:pPr>
         <w:pStyle w:val="Titre1"/>
       </w:pPr>
@@ -4162,527 +4892,18 @@
         <w:t>Pertinence :</w:t>
       </w:r>
     </w:p>
-    <w:p/>
-    <w:p>
-      <w:r>
-        <w:br w:type="page"/>
-      </w:r>
-    </w:p>
-    <w:p>
-      <w:r>
-        <w:lastRenderedPageBreak/>
-        <w:fldChar w:fldCharType="begin"/>
-      </w:r>
-      <w:r>
-        <w:instrText xml:space="preserve"> ADDIN ZOTERO_ITEM CSL_CITATION {"citationID":"Dz81apLq","properties":{"formattedCitation":"[14]","plainCitation":"[14]","noteIndex":0},"citationItems":[{"id":8,"uris":["http://zotero.org/users/local/ZDVQpXiA/items/2QBH88VI"],"itemData":{"id":8,"type":"article-journal","container-title":"Scientific Reports","DOI":"10.1038/s41598-024-73593-4","ISSN":"2045-2322","issue":"1","journalAbbreviation":"Sci Rep","language":"en","page":"22267","source":"DOI.org (Crossref)","title":"Expressivity attributed to music affects the smoothness of bowing movements in violinists","volume":"14","author":[{"family":"Di Stefano","given":"Nicola"},{"family":"Lo Presti","given":"Daniela"},{"family":"Raiano","given":"Luigi"},{"family":"Massaroni","given":"Carlo"},{"family":"Romano","given":"Chiara"},{"family":"Schena","given":"Emiliano"},{"family":"Leman","given":"Marc"},{"family":"Formica","given":"Domenico"}],"issued":{"date-parts":[["2024",9,27]]}}}],"schema":"https://github.com/citation-style-language/schema/raw/master/csl-citation.json"} </w:instrText>
-      </w:r>
-      <w:r>
-        <w:fldChar w:fldCharType="separate"/>
-      </w:r>
-      <w:r>
-        <w:rPr>
-          <w:rFonts w:ascii="Calibri" w:hAnsi="Calibri" w:cs="Calibri"/>
-        </w:rPr>
-        <w:t>[14]</w:t>
-      </w:r>
-      <w:r>
-        <w:fldChar w:fldCharType="end"/>
-      </w:r>
-    </w:p>
-    <w:p>
-      <w:r>
-        <w:t xml:space="preserve">N. Di Stefano </w:t>
-      </w:r>
-      <w:r>
-        <w:rPr>
-          <w:i/>
-          <w:iCs/>
-        </w:rPr>
-        <w:t>et al.</w:t>
-      </w:r>
-      <w:r>
-        <w:t>, « </w:t>
-      </w:r>
-      <w:proofErr w:type="spellStart"/>
-      <w:r>
-        <w:t>Expressivity</w:t>
-      </w:r>
-      <w:proofErr w:type="spellEnd"/>
-      <w:r>
-        <w:t xml:space="preserve"> </w:t>
-      </w:r>
-      <w:proofErr w:type="spellStart"/>
-      <w:r>
-        <w:t>attributed</w:t>
-      </w:r>
-      <w:proofErr w:type="spellEnd"/>
-      <w:r>
-        <w:t xml:space="preserve"> to music affects the </w:t>
-      </w:r>
-      <w:proofErr w:type="spellStart"/>
-      <w:r>
-        <w:t>smoothness</w:t>
-      </w:r>
-      <w:proofErr w:type="spellEnd"/>
-      <w:r>
-        <w:t xml:space="preserve"> of </w:t>
-      </w:r>
-      <w:proofErr w:type="spellStart"/>
-      <w:r>
-        <w:t>bowing</w:t>
-      </w:r>
-      <w:proofErr w:type="spellEnd"/>
-      <w:r>
-        <w:t xml:space="preserve"> </w:t>
-      </w:r>
-      <w:proofErr w:type="spellStart"/>
-      <w:r>
-        <w:t>movements</w:t>
-      </w:r>
-      <w:proofErr w:type="spellEnd"/>
-      <w:r>
-        <w:t xml:space="preserve"> in </w:t>
-      </w:r>
-      <w:proofErr w:type="spellStart"/>
-      <w:r>
-        <w:t>violinists</w:t>
-      </w:r>
-      <w:proofErr w:type="spellEnd"/>
-      <w:r>
-        <w:t xml:space="preserve"> », </w:t>
-      </w:r>
-      <w:proofErr w:type="spellStart"/>
-      <w:r>
-        <w:rPr>
-          <w:i/>
-          <w:iCs/>
-        </w:rPr>
-        <w:t>Sci</w:t>
-      </w:r>
-      <w:proofErr w:type="spellEnd"/>
-      <w:r>
-        <w:rPr>
-          <w:i/>
-          <w:iCs/>
-        </w:rPr>
-        <w:t>. Rep.</w:t>
-      </w:r>
-      <w:r>
-        <w:t>, vol. 14, n</w:t>
-      </w:r>
-      <w:r>
-        <w:rPr>
-          <w:vertAlign w:val="superscript"/>
-        </w:rPr>
-        <w:t>o</w:t>
-      </w:r>
-      <w:r>
-        <w:t xml:space="preserve"> 1, p. 22267, sept. 2024, </w:t>
-      </w:r>
-      <w:proofErr w:type="spellStart"/>
-      <w:proofErr w:type="gramStart"/>
-      <w:r>
-        <w:t>doi</w:t>
-      </w:r>
-      <w:proofErr w:type="spellEnd"/>
-      <w:r>
-        <w:t>:</w:t>
-      </w:r>
-      <w:proofErr w:type="gramEnd"/>
-      <w:r>
-        <w:t xml:space="preserve"> 10.1038/s41598-024-73593-4.</w:t>
-      </w:r>
-    </w:p>
-    <w:p>
-      <w:pPr>
-        <w:pStyle w:val="Titre1"/>
-      </w:pPr>
-      <w:r>
-        <w:t>Thème :</w:t>
-      </w:r>
-    </w:p>
-    <w:p>
-      <w:pPr>
-        <w:rPr>
-          <w:lang w:eastAsia="fr-BE"/>
-        </w:rPr>
-      </w:pPr>
-    </w:p>
-    <w:p>
-      <w:pPr>
-        <w:pStyle w:val="Titre1"/>
-      </w:pPr>
-      <w:r>
-        <w:t>Résumé :</w:t>
-      </w:r>
-    </w:p>
-    <w:p/>
-    <w:p>
-      <w:pPr>
-        <w:rPr>
-          <w:lang w:eastAsia="fr-BE"/>
-        </w:rPr>
-      </w:pPr>
-    </w:p>
-    <w:p>
-      <w:pPr>
-        <w:pStyle w:val="Titre1"/>
-      </w:pPr>
-      <w:r>
-        <w:t>Pertinence :</w:t>
-      </w:r>
-    </w:p>
-    <w:p/>
-    <w:p>
-      <w:r>
-        <w:br w:type="page"/>
-      </w:r>
-    </w:p>
-    <w:p>
-      <w:r>
-        <w:lastRenderedPageBreak/>
-        <w:fldChar w:fldCharType="begin"/>
-      </w:r>
-      <w:r>
-        <w:instrText xml:space="preserve"> ADDIN ZOTERO_ITEM CSL_CITATION {"citationID":"3K4AXTf5","properties":{"formattedCitation":"[15]","plainCitation":"[15]","noteIndex":0},"citationItems":[{"id":20,"uris":["http://zotero.org/users/local/ZDVQpXiA/items/MYHW69Z4"],"itemData":{"id":20,"type":"article-journal","abstract":"Introduction\n              Mental Workload (MWL) is a concept that has garnered increasing interest in professional settings but remains challenging to define consensually. The literature reports a plurality of operational definitions and assessment methods, with no established unified framework. This review aims to identify objective and validated measurement methods for evaluating MWL in real-world work contexts. Particular attention is given to neurophysiological methods, recognized for their efficiency and robustness, enabling real-time assessment without disrupting operator activity.\n            \n            \n              Method\n              To conduct this analysis, a systematic search was performed in three databases (PubMed, ScienceDirect, and IEEEXplore), covering studies published from their inception until March 30, 2023. Selection criteria included research focusing on MWL and its derivatives, as well as neurophysiological measures applied in real-world conditions. An initial screening based on titles and abstracts was followed by an in-depth review, assisted by the bibliometric software Rayyan.\n            \n            \n              Results\n              The explored concepts, applied methods, and study results were compiled into a synthesis table. Ultimately, 35 studies were included, highlighting the diversity of measurement tools used in field settings, often combined with subjective assessments.\n            \n            \n              Discussion\n              Furthermore, key physiological indicators such as ECG, eye data, EEG and the relationship between MWL metrics and those uses to measure stress are emphasized and discussed. A better understanding of these interrelations could refine the assessment of their respective impacts and help anticipate their consequences on workers' mental health and safety.","container-title":"Frontiers in Neuroergonomics","DOI":"10.3389/fnrgo.2025.1584736","ISSN":"2673-6195","journalAbbreviation":"Front. Neuroergonomics","page":"1584736","source":"DOI.org (Crossref)","title":"Systematic review of neurophysiological assessment techniques and metrics for mental workload evaluation in real-world settings","volume":"6","author":[{"family":"Diarra","given":"Moussa"},{"family":"Theurel","given":"Jean"},{"family":"Paty","given":"Benjamin"}],"issued":{"date-parts":[["2025",4,25]]}}}],"schema":"https://github.com/citation-style-language/schema/raw/master/csl-citation.json"} </w:instrText>
-      </w:r>
-      <w:r>
-        <w:fldChar w:fldCharType="separate"/>
-      </w:r>
-      <w:r>
-        <w:rPr>
-          <w:rFonts w:ascii="Calibri" w:hAnsi="Calibri" w:cs="Calibri"/>
-        </w:rPr>
-        <w:t>[15]</w:t>
-      </w:r>
-      <w:r>
-        <w:fldChar w:fldCharType="end"/>
-      </w:r>
-    </w:p>
-    <w:p>
-      <w:r>
-        <w:t xml:space="preserve">M. Diarra, J. </w:t>
-      </w:r>
-      <w:proofErr w:type="spellStart"/>
-      <w:r>
-        <w:t>Theurel</w:t>
-      </w:r>
-      <w:proofErr w:type="spellEnd"/>
-      <w:r>
-        <w:t>, et B. Paty, « </w:t>
-      </w:r>
-      <w:proofErr w:type="spellStart"/>
-      <w:r>
-        <w:t>Systematic</w:t>
-      </w:r>
-      <w:proofErr w:type="spellEnd"/>
-      <w:r>
-        <w:t xml:space="preserve"> </w:t>
-      </w:r>
-      <w:proofErr w:type="spellStart"/>
-      <w:r>
-        <w:t>review</w:t>
-      </w:r>
-      <w:proofErr w:type="spellEnd"/>
-      <w:r>
-        <w:t xml:space="preserve"> of </w:t>
-      </w:r>
-      <w:proofErr w:type="spellStart"/>
-      <w:r>
-        <w:t>neurophysiological</w:t>
-      </w:r>
-      <w:proofErr w:type="spellEnd"/>
-      <w:r>
-        <w:t xml:space="preserve"> </w:t>
-      </w:r>
-      <w:proofErr w:type="spellStart"/>
-      <w:r>
-        <w:t>assessment</w:t>
-      </w:r>
-      <w:proofErr w:type="spellEnd"/>
-      <w:r>
-        <w:t xml:space="preserve"> techniques and </w:t>
-      </w:r>
-      <w:proofErr w:type="spellStart"/>
-      <w:r>
-        <w:t>metrics</w:t>
-      </w:r>
-      <w:proofErr w:type="spellEnd"/>
-      <w:r>
-        <w:t xml:space="preserve"> for mental </w:t>
-      </w:r>
-      <w:proofErr w:type="spellStart"/>
-      <w:r>
-        <w:t>workload</w:t>
-      </w:r>
-      <w:proofErr w:type="spellEnd"/>
-      <w:r>
-        <w:t xml:space="preserve"> </w:t>
-      </w:r>
-      <w:proofErr w:type="spellStart"/>
-      <w:r>
-        <w:t>evaluation</w:t>
-      </w:r>
-      <w:proofErr w:type="spellEnd"/>
-      <w:r>
-        <w:t xml:space="preserve"> in real-world settings », </w:t>
-      </w:r>
-      <w:r>
-        <w:rPr>
-          <w:i/>
-          <w:iCs/>
-        </w:rPr>
-        <w:t xml:space="preserve">Front. </w:t>
-      </w:r>
-      <w:proofErr w:type="spellStart"/>
-      <w:r>
-        <w:rPr>
-          <w:i/>
-          <w:iCs/>
-        </w:rPr>
-        <w:t>Neuroergonomics</w:t>
-      </w:r>
-      <w:proofErr w:type="spellEnd"/>
-      <w:r>
-        <w:t xml:space="preserve">, vol. 6, p. 1584736, avr. 2025, </w:t>
-      </w:r>
-      <w:proofErr w:type="spellStart"/>
-      <w:proofErr w:type="gramStart"/>
-      <w:r>
-        <w:t>doi</w:t>
-      </w:r>
-      <w:proofErr w:type="spellEnd"/>
-      <w:r>
-        <w:t>:</w:t>
-      </w:r>
-      <w:proofErr w:type="gramEnd"/>
-      <w:r>
-        <w:t xml:space="preserve"> 10.3389/fnrgo.2025.1584736.</w:t>
-      </w:r>
-    </w:p>
-    <w:p>
-      <w:pPr>
-        <w:pStyle w:val="Titre1"/>
-      </w:pPr>
-      <w:r>
-        <w:t>Thème :</w:t>
-      </w:r>
-    </w:p>
-    <w:p>
-      <w:pPr>
-        <w:rPr>
-          <w:lang w:eastAsia="fr-BE"/>
-        </w:rPr>
-      </w:pPr>
-    </w:p>
-    <w:p>
-      <w:pPr>
-        <w:pStyle w:val="Titre1"/>
-      </w:pPr>
-      <w:r>
-        <w:t>Résumé :</w:t>
-      </w:r>
-    </w:p>
-    <w:p>
-      <w:pPr>
-        <w:rPr>
-          <w:lang w:eastAsia="fr-BE"/>
-        </w:rPr>
-      </w:pPr>
-    </w:p>
-    <w:p>
-      <w:pPr>
-        <w:pStyle w:val="Titre1"/>
-      </w:pPr>
-      <w:r>
-        <w:t>Pertinence :</w:t>
-      </w:r>
-    </w:p>
-    <w:p/>
-    <w:p/>
-    <w:p>
-      <w:r>
-        <w:br w:type="page"/>
-      </w:r>
-    </w:p>
-    <w:p>
-      <w:r>
-        <w:lastRenderedPageBreak/>
-        <w:fldChar w:fldCharType="begin"/>
-      </w:r>
-      <w:r>
-        <w:instrText xml:space="preserve"> ADDIN ZOTERO_ITEM CSL_CITATION {"citationID":"3mPyFzCb","properties":{"formattedCitation":"[16]","plainCitation":"[16]","noteIndex":0},"citationItems":[{"id":26,"uris":["http://zotero.org/users/local/ZDVQpXiA/items/JEUHP83W"],"itemData":{"id":26,"type":"article-journal","abstract":"Electroencephalographic (EEG) signal-based personal identification systems have notable advantages and disadvantages. These systems heavily rely on the stability of EEG signals, which several factors. One of the primary factors affecting the stability of EEG signals is an individual's emotional state. Among emotional states, stress significantly impairs people's ability to perform daily tasks. This research aims to identify stress levels, classified as low (2) and high (1), using features from Independent Component Analysis (ICA) and Principal Component Analysis (PCA). Machine learning methods, including Decision Tree, k-Nearest Neighbors (k-NN), Naive Bayes, Support Vector Machine (SVM), and Ensemble techniques, are employed to classify the stress levels. The dataset comprises 40 EEG recordings from the Stroop color-word test, and the data is split using a random holdout function with a ratio of 80% for training and 20% for testing. This study examines the most effective features for identifying stress levels and compares the performance of various machine learning models. The experimental results demonstrate that PCA is the most effective feature extraction method, achieving an average accuracy of 0.718 in stress level classification. Among the machine learning models tested, the Ensemble method performs the best, achieving an accuracy of 0.770 when using PCA features and 0.745 with ICA features. This study highlights the importance of selecting optimal features and machine learning techniques for improving stress detection in EEG-based systems. Further improvements in classification accuracy may be achieved by incorporating additional physiological signals or refining feature extraction techniques.","container-title":"JOIV : International Journal on Informatics Visualization","DOI":"10.62527/joiv.9.3.3378","ISSN":"2549-9904, 2549-9610","issue":"3","journalAbbreviation":"JOIV : Int. J. Inform. Visualization","license":"http://creativecommons.org/licenses/by-sa/4.0","page":"1226","source":"DOI.org (Crossref)","title":"A Hybrid Machine Learning Approach Utilizing PCA and ICA Features for Stress Classification","volume":"9","author":[{"family":"Setyorini","given":"Setyorini"},{"family":"Elbaith Zaeni","given":"Ilham Ari"},{"family":"Elmunsyah","given":"Hakkun"}],"issued":{"date-parts":[["2025",5,31]]}}}],"schema":"https://github.com/citation-style-language/schema/raw/master/csl-citation.json"} </w:instrText>
-      </w:r>
-      <w:r>
-        <w:fldChar w:fldCharType="separate"/>
-      </w:r>
-      <w:r>
-        <w:rPr>
-          <w:rFonts w:ascii="Calibri" w:hAnsi="Calibri" w:cs="Calibri"/>
-        </w:rPr>
-        <w:t>[16]</w:t>
-      </w:r>
-      <w:r>
-        <w:fldChar w:fldCharType="end"/>
-      </w:r>
-    </w:p>
-    <w:p>
-      <w:r>
-        <w:t xml:space="preserve">S. </w:t>
-      </w:r>
-      <w:proofErr w:type="spellStart"/>
-      <w:r>
-        <w:t>Setyorini</w:t>
-      </w:r>
-      <w:proofErr w:type="spellEnd"/>
-      <w:r>
-        <w:t xml:space="preserve">, I. A. </w:t>
-      </w:r>
-      <w:proofErr w:type="spellStart"/>
-      <w:r>
-        <w:t>Elbaith</w:t>
-      </w:r>
-      <w:proofErr w:type="spellEnd"/>
-      <w:r>
-        <w:t xml:space="preserve"> </w:t>
-      </w:r>
-      <w:proofErr w:type="spellStart"/>
-      <w:r>
-        <w:t>Zaeni</w:t>
-      </w:r>
-      <w:proofErr w:type="spellEnd"/>
-      <w:r>
-        <w:t xml:space="preserve">, et H. </w:t>
-      </w:r>
-      <w:proofErr w:type="spellStart"/>
-      <w:r>
-        <w:t>Elmunsyah</w:t>
-      </w:r>
-      <w:proofErr w:type="spellEnd"/>
-      <w:r>
-        <w:t xml:space="preserve">, « A </w:t>
-      </w:r>
-      <w:proofErr w:type="spellStart"/>
-      <w:r>
-        <w:t>Hybrid</w:t>
-      </w:r>
-      <w:proofErr w:type="spellEnd"/>
-      <w:r>
-        <w:t xml:space="preserve"> Machine Learning </w:t>
-      </w:r>
-      <w:proofErr w:type="spellStart"/>
-      <w:r>
-        <w:t>Approach</w:t>
-      </w:r>
-      <w:proofErr w:type="spellEnd"/>
-      <w:r>
-        <w:t xml:space="preserve"> </w:t>
-      </w:r>
-      <w:proofErr w:type="spellStart"/>
-      <w:r>
-        <w:t>Utilizing</w:t>
-      </w:r>
-      <w:proofErr w:type="spellEnd"/>
-      <w:r>
-        <w:t xml:space="preserve"> PCA and ICA </w:t>
-      </w:r>
-      <w:proofErr w:type="spellStart"/>
-      <w:r>
-        <w:t>Features</w:t>
-      </w:r>
-      <w:proofErr w:type="spellEnd"/>
-      <w:r>
-        <w:t xml:space="preserve"> for Stress Classification », </w:t>
-      </w:r>
-      <w:r>
-        <w:rPr>
-          <w:i/>
-          <w:iCs/>
-        </w:rPr>
-        <w:t xml:space="preserve">JOIV Int. J. </w:t>
-      </w:r>
-      <w:proofErr w:type="spellStart"/>
-      <w:r>
-        <w:rPr>
-          <w:i/>
-          <w:iCs/>
-        </w:rPr>
-        <w:t>Inform</w:t>
-      </w:r>
-      <w:proofErr w:type="spellEnd"/>
-      <w:r>
-        <w:rPr>
-          <w:i/>
-          <w:iCs/>
-        </w:rPr>
-        <w:t>. Vis.</w:t>
-      </w:r>
-      <w:r>
-        <w:t>, vol. 9, n</w:t>
-      </w:r>
-      <w:r>
-        <w:rPr>
-          <w:vertAlign w:val="superscript"/>
-        </w:rPr>
-        <w:t>o</w:t>
-      </w:r>
-      <w:r>
-        <w:t xml:space="preserve"> 3, p. 1226, mai 2025, </w:t>
-      </w:r>
-      <w:proofErr w:type="spellStart"/>
-      <w:proofErr w:type="gramStart"/>
-      <w:r>
-        <w:t>doi</w:t>
-      </w:r>
-      <w:proofErr w:type="spellEnd"/>
-      <w:r>
-        <w:t>:</w:t>
-      </w:r>
-      <w:proofErr w:type="gramEnd"/>
-      <w:r>
-        <w:t xml:space="preserve"> 10.62527/joiv.9.3.3378.</w:t>
-      </w:r>
-    </w:p>
-    <w:p>
-      <w:pPr>
-        <w:pStyle w:val="Titre1"/>
-      </w:pPr>
-      <w:r>
-        <w:t>Thème :</w:t>
-      </w:r>
-    </w:p>
-    <w:p>
-      <w:pPr>
-        <w:rPr>
-          <w:lang w:eastAsia="fr-BE"/>
-        </w:rPr>
-      </w:pPr>
-    </w:p>
-    <w:p>
-      <w:pPr>
-        <w:pStyle w:val="Titre1"/>
-      </w:pPr>
-      <w:r>
-        <w:t>Résumé :</w:t>
-      </w:r>
-    </w:p>
-    <w:p/>
-    <w:p>
-      <w:pPr>
-        <w:rPr>
-          <w:lang w:eastAsia="fr-BE"/>
-        </w:rPr>
-      </w:pPr>
-    </w:p>
-    <w:p>
-      <w:pPr>
-        <w:pStyle w:val="Titre1"/>
-      </w:pPr>
-      <w:r>
-        <w:t>Pertinence :</w:t>
-      </w:r>
-    </w:p>
-    <w:p>
+    <w:p>
+      <w:pPr>
+        <w:pStyle w:val="Titre1"/>
+      </w:pPr>
+      <w:r>
+        <w:t>Score :</w:t>
+      </w:r>
+    </w:p>
+    <w:p>
+      <w:r>
+        <w:t>0</w:t>
+      </w:r>
       <w:r>
         <w:br w:type="page"/>
       </w:r>
@@ -6516,7 +6737,7 @@
 </file>
 
 <file path=customXml/itemProps1.xml><?xml version="1.0" encoding="utf-8"?>
-<ds:datastoreItem xmlns:ds="http://schemas.openxmlformats.org/officeDocument/2006/customXml" ds:itemID="{6EB41F50-D8BB-4F1F-8114-B96272A856DB}">
+<ds:datastoreItem xmlns:ds="http://schemas.openxmlformats.org/officeDocument/2006/customXml" ds:itemID="{28603AD4-C6CE-4BF7-8EEB-98A14FBF4472}">
   <ds:schemaRefs>
     <ds:schemaRef ds:uri="http://schemas.openxmlformats.org/officeDocument/2006/bibliography"/>
   </ds:schemaRefs>

</xml_diff>